<commit_message>
added comments to experiment proposal
</commit_message>
<xml_diff>
--- a/my_report/Experiment Proposal.docx
+++ b/my_report/Experiment Proposal.docx
@@ -20,19 +20,19 @@
         </w:rPr>
         <w:t xml:space="preserve">Experiment Proposal </w:t>
       </w:r>
-    </w:p>
-    <w:p>
-      <w:pPr>
-        <w:pStyle w:val="Heading1"/>
-        <w:numPr>
-          <w:ilvl w:val="0"/>
-          <w:numId w:val="6"/>
-        </w:numPr>
-      </w:pPr>
       <w:bookmarkStart w:id="1" w:name="_uvme7d1oxmyq" w:colFirst="0" w:colLast="0"/>
       <w:bookmarkEnd w:id="1"/>
-      <w:r>
-        <w:t xml:space="preserve"> The test? </w:t>
+    </w:p>
+    <w:p>
+      <w:pPr>
+        <w:pStyle w:val="Heading1"/>
+        <w:numPr>
+          <w:ilvl w:val="0"/>
+          <w:numId w:val="6"/>
+        </w:numPr>
+      </w:pPr>
+      <w:r>
+        <w:t xml:space="preserve">The test? </w:t>
       </w:r>
     </w:p>
     <w:p>
@@ -64,7 +64,23 @@
           <w:sz w:val="21"/>
           <w:szCs w:val="21"/>
         </w:rPr>
-        <w:t xml:space="preserve"> the foreign language teachers in their regular pedagogical practices, specifically in creating dynamic lesson plans more efficiently and to what extent.</w:t>
+        <w:t xml:space="preserve"> the foreign language teachers </w:t>
+      </w:r>
+      <w:proofErr w:type="gramStart"/>
+      <w:r>
+        <w:rPr>
+          <w:sz w:val="21"/>
+          <w:szCs w:val="21"/>
+        </w:rPr>
+        <w:t>in</w:t>
+      </w:r>
+      <w:proofErr w:type="gramEnd"/>
+      <w:r>
+        <w:rPr>
+          <w:sz w:val="21"/>
+          <w:szCs w:val="21"/>
+        </w:rPr>
+        <w:t xml:space="preserve"> their regular pedagogical practices, specifically in creating dynamic lesson plans more efficiently and to what extent.</w:t>
       </w:r>
     </w:p>
     <w:p>
@@ -103,7 +119,23 @@
           <w:sz w:val="21"/>
           <w:szCs w:val="21"/>
         </w:rPr>
-        <w:t xml:space="preserve"> 30 minute sessions with each subject. </w:t>
+        <w:t xml:space="preserve"> </w:t>
+      </w:r>
+      <w:proofErr w:type="gramStart"/>
+      <w:r>
+        <w:rPr>
+          <w:sz w:val="21"/>
+          <w:szCs w:val="21"/>
+        </w:rPr>
+        <w:t>30 minute</w:t>
+      </w:r>
+      <w:proofErr w:type="gramEnd"/>
+      <w:r>
+        <w:rPr>
+          <w:sz w:val="21"/>
+          <w:szCs w:val="21"/>
+        </w:rPr>
+        <w:t xml:space="preserve"> sessions with each subject. </w:t>
       </w:r>
     </w:p>
     <w:p>
@@ -200,7 +232,23 @@
           <w:sz w:val="21"/>
           <w:szCs w:val="21"/>
         </w:rPr>
-        <w:t xml:space="preserve">The EC explains the TS the confidentiality clauses for the personal information collected and mentions how and what information is to be used on public documents. </w:t>
+        <w:t xml:space="preserve">The EC explains the TS the confidentiality clauses for the personal information collected and mentions how and what information is to be used </w:t>
+      </w:r>
+      <w:proofErr w:type="gramStart"/>
+      <w:r>
+        <w:rPr>
+          <w:sz w:val="21"/>
+          <w:szCs w:val="21"/>
+        </w:rPr>
+        <w:t>on</w:t>
+      </w:r>
+      <w:proofErr w:type="gramEnd"/>
+      <w:r>
+        <w:rPr>
+          <w:sz w:val="21"/>
+          <w:szCs w:val="21"/>
+        </w:rPr>
+        <w:t xml:space="preserve"> public documents. </w:t>
       </w:r>
       <w:r>
         <w:rPr>
@@ -296,7 +344,23 @@
           <w:sz w:val="21"/>
           <w:szCs w:val="21"/>
         </w:rPr>
-        <w:t xml:space="preserve"> The EC asks TS to fill the consent form 3(a). </w:t>
+        <w:t xml:space="preserve"> The EC asks TS to </w:t>
+      </w:r>
+      <w:proofErr w:type="gramStart"/>
+      <w:r>
+        <w:rPr>
+          <w:sz w:val="21"/>
+          <w:szCs w:val="21"/>
+        </w:rPr>
+        <w:t>fill</w:t>
+      </w:r>
+      <w:proofErr w:type="gramEnd"/>
+      <w:r>
+        <w:rPr>
+          <w:sz w:val="21"/>
+          <w:szCs w:val="21"/>
+        </w:rPr>
+        <w:t xml:space="preserve"> the consent form 3(a). </w:t>
       </w:r>
     </w:p>
     <w:p>
@@ -334,7 +398,7 @@
           <w:sz w:val="21"/>
           <w:szCs w:val="21"/>
         </w:rPr>
-        <w:t xml:space="preserve">EC explains TS that they are to be given a piece of paper with a pre-decided </w:t>
+        <w:t xml:space="preserve">EC explains TS that they are to be given a piece of paper with a pre-decided topic and they </w:t>
       </w:r>
       <w:proofErr w:type="gramStart"/>
       <w:r>
@@ -342,7 +406,7 @@
           <w:sz w:val="21"/>
           <w:szCs w:val="21"/>
         </w:rPr>
-        <w:t>topic</w:t>
+        <w:t>have to</w:t>
       </w:r>
       <w:proofErr w:type="gramEnd"/>
       <w:r>
@@ -350,23 +414,21 @@
           <w:sz w:val="21"/>
           <w:szCs w:val="21"/>
         </w:rPr>
-        <w:t xml:space="preserve"> and they </w:t>
-      </w:r>
-      <w:proofErr w:type="gramStart"/>
-      <w:r>
-        <w:rPr>
-          <w:sz w:val="21"/>
-          <w:szCs w:val="21"/>
-        </w:rPr>
-        <w:t>have to</w:t>
-      </w:r>
-      <w:proofErr w:type="gramEnd"/>
-      <w:r>
-        <w:rPr>
-          <w:sz w:val="21"/>
-          <w:szCs w:val="21"/>
-        </w:rPr>
-        <w:t xml:space="preserve"> prepare a lesson plan to be 5e level for a duration of 2h (two sessions of 1h each). </w:t>
+        <w:t xml:space="preserve"> prepare a lesson plan to be </w:t>
+      </w:r>
+      <w:r>
+        <w:rPr>
+          <w:sz w:val="21"/>
+          <w:szCs w:val="21"/>
+        </w:rPr>
+        <w:t>5e</w:t>
+      </w:r>
+      <w:r>
+        <w:rPr>
+          <w:sz w:val="21"/>
+          <w:szCs w:val="21"/>
+        </w:rPr>
+        <w:t xml:space="preserve"> level for a duration of 2h (two sessions of 1h each). </w:t>
       </w:r>
     </w:p>
     <w:p>
@@ -617,7 +679,23 @@
         </w:numPr>
       </w:pPr>
       <w:r>
-        <w:t xml:space="preserve">EC explains that Ts is to be video recorded at this stage however this video is only for analysis reference and is not to be uploaded in public platforms and is to be deleted after the work. </w:t>
+        <w:t xml:space="preserve">EC explains that Ts is to be video recorded at this stage however this video is only for analysis reference and is not to be uploaded </w:t>
+      </w:r>
+      <w:proofErr w:type="gramStart"/>
+      <w:r>
+        <w:t>in</w:t>
+      </w:r>
+      <w:proofErr w:type="gramEnd"/>
+      <w:r>
+        <w:t xml:space="preserve"> public platforms and is to be deleted after </w:t>
+      </w:r>
+      <w:proofErr w:type="gramStart"/>
+      <w:r>
+        <w:t>the work</w:t>
+      </w:r>
+      <w:proofErr w:type="gramEnd"/>
+      <w:r>
+        <w:t xml:space="preserve">. </w:t>
       </w:r>
     </w:p>
     <w:p>
@@ -648,7 +726,23 @@
           <w:sz w:val="21"/>
           <w:szCs w:val="21"/>
         </w:rPr>
-        <w:t xml:space="preserve"> the EC asks TS to fill the consent form 3(a)</w:t>
+        <w:t xml:space="preserve"> the EC asks TS to </w:t>
+      </w:r>
+      <w:proofErr w:type="gramStart"/>
+      <w:r>
+        <w:rPr>
+          <w:sz w:val="21"/>
+          <w:szCs w:val="21"/>
+        </w:rPr>
+        <w:t>fill</w:t>
+      </w:r>
+      <w:proofErr w:type="gramEnd"/>
+      <w:r>
+        <w:rPr>
+          <w:sz w:val="21"/>
+          <w:szCs w:val="21"/>
+        </w:rPr>
+        <w:t xml:space="preserve"> the consent form 3(a)</w:t>
       </w:r>
     </w:p>
     <w:p>
@@ -893,7 +987,23 @@
           <w:sz w:val="21"/>
           <w:szCs w:val="21"/>
         </w:rPr>
-        <w:t xml:space="preserve">After the questioning EC is to declare that phase I is complete. </w:t>
+        <w:t xml:space="preserve">After </w:t>
+      </w:r>
+      <w:proofErr w:type="gramStart"/>
+      <w:r>
+        <w:rPr>
+          <w:sz w:val="21"/>
+          <w:szCs w:val="21"/>
+        </w:rPr>
+        <w:t>the questioning</w:t>
+      </w:r>
+      <w:proofErr w:type="gramEnd"/>
+      <w:r>
+        <w:rPr>
+          <w:sz w:val="21"/>
+          <w:szCs w:val="21"/>
+        </w:rPr>
+        <w:t xml:space="preserve"> EC is to declare that phase I is complete. </w:t>
       </w:r>
     </w:p>
     <w:p/>
@@ -934,7 +1044,15 @@
     <w:p/>
     <w:p>
       <w:r>
-        <w:t xml:space="preserve">This is an experiment destined to be included in the master’s thesis and is to be held in two phases between the experiment conductor and the participant teacher. This form is dedicated to the first phase of the experiment. Please note that the actual name of the participant will remain strictly for the experiment conductor’s reference and will not be mentioned on any document available publicly including the final thesis document. </w:t>
+        <w:t xml:space="preserve">This is an experiment destined to be included in the master’s thesis and is to be held in two phases between the experiment conductor and the participant teacher. This form is dedicated to the first phase of the experiment. Please note that the actual name of the participant will remain strictly for the experiment conductor’s reference and will not be mentioned </w:t>
+      </w:r>
+      <w:proofErr w:type="gramStart"/>
+      <w:r>
+        <w:t>on</w:t>
+      </w:r>
+      <w:proofErr w:type="gramEnd"/>
+      <w:r>
+        <w:t xml:space="preserve"> any document available publicly including the final thesis document. </w:t>
       </w:r>
     </w:p>
     <w:p/>
@@ -1053,25 +1171,32 @@
     <w:p/>
     <w:p>
       <w:r>
-        <w:t xml:space="preserve"> __________________</w:t>
-      </w:r>
-      <w:r>
-        <w:tab/>
-      </w:r>
-      <w:r>
-        <w:tab/>
-      </w:r>
-      <w:r>
-        <w:tab/>
-      </w:r>
-      <w:r>
-        <w:tab/>
-      </w:r>
-      <w:r>
-        <w:tab/>
-      </w:r>
-      <w:r>
-        <w:tab/>
+        <w:t xml:space="preserve"> _________________</w:t>
+      </w:r>
+      <w:proofErr w:type="gramStart"/>
+      <w:r>
+        <w:t>_</w:t>
+      </w:r>
+      <w:r>
+        <w:tab/>
+      </w:r>
+      <w:r>
+        <w:tab/>
+      </w:r>
+      <w:r>
+        <w:tab/>
+      </w:r>
+      <w:r>
+        <w:tab/>
+      </w:r>
+      <w:r>
+        <w:tab/>
+      </w:r>
+      <w:r>
+        <w:tab/>
+      </w:r>
+      <w:proofErr w:type="gramEnd"/>
+      <w:r>
         <w:t>________________</w:t>
       </w:r>
     </w:p>
@@ -1310,12 +1435,36 @@
     <w:p/>
     <w:p>
       <w:r>
-        <w:t xml:space="preserve">This is an experiment destined to be included in the master’s thesis and is to be held in two phases between the experiment conductor and the participant teacher. This form is dedicated to the second and final phase of the experiment. As mentioned earlier the actual name of the participant will remain strictly for the experiment conductor’s reference and will not be mentioned on any document available publicly including the final thesis document. </w:t>
-      </w:r>
-    </w:p>
-    <w:p>
-      <w:r>
-        <w:t xml:space="preserve">This stage (II) of the experiment needs the experiment conductor to video record the participant teacher; however, the video clip is only to be used for analysis and will not be uploaded or used in any public platform or document. The video is to be deleted immediately after the analysis is complete. </w:t>
+        <w:t xml:space="preserve">This is an experiment destined to be included in the master’s thesis and is to be held in two phases between the experiment conductor and the participant teacher. This form is dedicated to the second and final phase of the experiment. As mentioned earlier the actual name of the participant will remain strictly </w:t>
+      </w:r>
+      <w:proofErr w:type="gramStart"/>
+      <w:r>
+        <w:t>for</w:t>
+      </w:r>
+      <w:proofErr w:type="gramEnd"/>
+      <w:r>
+        <w:t xml:space="preserve"> the experiment conductor’s reference and will not be mentioned </w:t>
+      </w:r>
+      <w:proofErr w:type="gramStart"/>
+      <w:r>
+        <w:t>on</w:t>
+      </w:r>
+      <w:proofErr w:type="gramEnd"/>
+      <w:r>
+        <w:t xml:space="preserve"> any document available publicly including the final thesis document. </w:t>
+      </w:r>
+    </w:p>
+    <w:p>
+      <w:r>
+        <w:t xml:space="preserve">This stage (II) of the experiment needs the experiment conductor to video record the participant teacher; however, the video clip is only to be used for analysis and will not be uploaded or used </w:t>
+      </w:r>
+      <w:proofErr w:type="gramStart"/>
+      <w:r>
+        <w:t>in</w:t>
+      </w:r>
+      <w:proofErr w:type="gramEnd"/>
+      <w:r>
+        <w:t xml:space="preserve"> any public platform or document. The video is to be deleted immediately after the analysis is complete. </w:t>
       </w:r>
     </w:p>
     <w:p/>
@@ -1327,15 +1476,31 @@
     <w:p>
       <w:r>
         <w:br/>
-        <w:t xml:space="preserve">The experiment conductor may provide a pseudonym (ex: Subject A) to the participant and </w:t>
+        <w:t xml:space="preserve">The experiment conductor may provide a pseudonym (ex: Subject A) to the </w:t>
       </w:r>
       <w:proofErr w:type="gramStart"/>
       <w:r>
+        <w:t>participant and</w:t>
+      </w:r>
+      <w:proofErr w:type="gramEnd"/>
+      <w:r>
+        <w:t xml:space="preserve"> </w:t>
+      </w:r>
+      <w:proofErr w:type="gramStart"/>
+      <w:r>
         <w:t>in order to</w:t>
       </w:r>
       <w:proofErr w:type="gramEnd"/>
       <w:r>
-        <w:t xml:space="preserve"> mention any such information in the public document. </w:t>
+        <w:t xml:space="preserve"> mention any such information in </w:t>
+      </w:r>
+      <w:proofErr w:type="gramStart"/>
+      <w:r>
+        <w:t>the public</w:t>
+      </w:r>
+      <w:proofErr w:type="gramEnd"/>
+      <w:r>
+        <w:t xml:space="preserve"> document. </w:t>
       </w:r>
     </w:p>
     <w:p/>
@@ -1441,25 +1606,32 @@
     <w:p/>
     <w:p>
       <w:r>
-        <w:t xml:space="preserve"> __________________</w:t>
-      </w:r>
-      <w:r>
-        <w:tab/>
-      </w:r>
-      <w:r>
-        <w:tab/>
-      </w:r>
-      <w:r>
-        <w:tab/>
-      </w:r>
-      <w:r>
-        <w:tab/>
-      </w:r>
-      <w:r>
-        <w:tab/>
-      </w:r>
-      <w:r>
-        <w:tab/>
+        <w:t xml:space="preserve"> _________________</w:t>
+      </w:r>
+      <w:proofErr w:type="gramStart"/>
+      <w:r>
+        <w:t>_</w:t>
+      </w:r>
+      <w:r>
+        <w:tab/>
+      </w:r>
+      <w:r>
+        <w:tab/>
+      </w:r>
+      <w:r>
+        <w:tab/>
+      </w:r>
+      <w:r>
+        <w:tab/>
+      </w:r>
+      <w:r>
+        <w:tab/>
+      </w:r>
+      <w:r>
+        <w:tab/>
+      </w:r>
+      <w:proofErr w:type="gramEnd"/>
+      <w:r>
         <w:t>________________</w:t>
       </w:r>
     </w:p>
@@ -1976,7 +2148,15 @@
         </w:numPr>
       </w:pPr>
       <w:r>
-        <w:t>Different file for each participant</w:t>
+        <w:t xml:space="preserve">Different </w:t>
+      </w:r>
+      <w:proofErr w:type="gramStart"/>
+      <w:r>
+        <w:t>file</w:t>
+      </w:r>
+      <w:proofErr w:type="gramEnd"/>
+      <w:r>
+        <w:t xml:space="preserve"> for each participant</w:t>
       </w:r>
     </w:p>
     <w:p>
@@ -3379,6 +3559,138 @@
       <w:tblStyleColBandSize w:val="1"/>
     </w:tblPr>
   </w:style>
+  <w:style w:type="paragraph" w:styleId="TOCHeading">
+    <w:name w:val="TOC Heading"/>
+    <w:basedOn w:val="Heading1"/>
+    <w:next w:val="Normal"/>
+    <w:uiPriority w:val="39"/>
+    <w:unhideWhenUsed/>
+    <w:qFormat/>
+    <w:rsid w:val="00951053"/>
+    <w:pPr>
+      <w:spacing w:before="240" w:after="0" w:line="259" w:lineRule="auto"/>
+      <w:outlineLvl w:val="9"/>
+    </w:pPr>
+    <w:rPr>
+      <w:rFonts w:asciiTheme="majorHAnsi" w:eastAsiaTheme="majorEastAsia" w:hAnsiTheme="majorHAnsi" w:cstheme="majorBidi"/>
+      <w:color w:val="365F91" w:themeColor="accent1" w:themeShade="BF"/>
+      <w:sz w:val="32"/>
+      <w:szCs w:val="32"/>
+      <w:lang w:val="en-US" w:eastAsia="en-US"/>
+    </w:rPr>
+  </w:style>
+  <w:style w:type="paragraph" w:styleId="TOC1">
+    <w:name w:val="toc 1"/>
+    <w:basedOn w:val="Normal"/>
+    <w:next w:val="Normal"/>
+    <w:autoRedefine/>
+    <w:uiPriority w:val="39"/>
+    <w:unhideWhenUsed/>
+    <w:rsid w:val="00951053"/>
+    <w:pPr>
+      <w:spacing w:after="100"/>
+    </w:pPr>
+  </w:style>
+  <w:style w:type="paragraph" w:styleId="TOC3">
+    <w:name w:val="toc 3"/>
+    <w:basedOn w:val="Normal"/>
+    <w:next w:val="Normal"/>
+    <w:autoRedefine/>
+    <w:uiPriority w:val="39"/>
+    <w:unhideWhenUsed/>
+    <w:rsid w:val="00951053"/>
+    <w:pPr>
+      <w:spacing w:after="100"/>
+      <w:ind w:left="440"/>
+    </w:pPr>
+  </w:style>
+  <w:style w:type="character" w:styleId="Hyperlink">
+    <w:name w:val="Hyperlink"/>
+    <w:basedOn w:val="DefaultParagraphFont"/>
+    <w:uiPriority w:val="99"/>
+    <w:unhideWhenUsed/>
+    <w:rsid w:val="00951053"/>
+    <w:rPr>
+      <w:color w:val="0000FF" w:themeColor="hyperlink"/>
+      <w:u w:val="single"/>
+    </w:rPr>
+  </w:style>
+  <w:style w:type="paragraph" w:styleId="Revision">
+    <w:name w:val="Revision"/>
+    <w:hidden/>
+    <w:uiPriority w:val="99"/>
+    <w:semiHidden/>
+    <w:rsid w:val="00951053"/>
+    <w:pPr>
+      <w:spacing w:line="240" w:lineRule="auto"/>
+    </w:pPr>
+  </w:style>
+  <w:style w:type="character" w:styleId="CommentReference">
+    <w:name w:val="annotation reference"/>
+    <w:basedOn w:val="DefaultParagraphFont"/>
+    <w:uiPriority w:val="99"/>
+    <w:semiHidden/>
+    <w:unhideWhenUsed/>
+    <w:rsid w:val="00951053"/>
+    <w:rPr>
+      <w:sz w:val="16"/>
+      <w:szCs w:val="16"/>
+    </w:rPr>
+  </w:style>
+  <w:style w:type="paragraph" w:styleId="CommentText">
+    <w:name w:val="annotation text"/>
+    <w:basedOn w:val="Normal"/>
+    <w:link w:val="CommentTextChar"/>
+    <w:uiPriority w:val="99"/>
+    <w:unhideWhenUsed/>
+    <w:rsid w:val="00951053"/>
+    <w:pPr>
+      <w:spacing w:line="240" w:lineRule="auto"/>
+    </w:pPr>
+    <w:rPr>
+      <w:sz w:val="20"/>
+      <w:szCs w:val="20"/>
+    </w:rPr>
+  </w:style>
+  <w:style w:type="character" w:customStyle="1" w:styleId="CommentTextChar">
+    <w:name w:val="Comment Text Char"/>
+    <w:basedOn w:val="DefaultParagraphFont"/>
+    <w:link w:val="CommentText"/>
+    <w:uiPriority w:val="99"/>
+    <w:rsid w:val="00951053"/>
+    <w:rPr>
+      <w:sz w:val="20"/>
+      <w:szCs w:val="20"/>
+    </w:rPr>
+  </w:style>
+  <w:style w:type="paragraph" w:styleId="CommentSubject">
+    <w:name w:val="annotation subject"/>
+    <w:basedOn w:val="CommentText"/>
+    <w:next w:val="CommentText"/>
+    <w:link w:val="CommentSubjectChar"/>
+    <w:uiPriority w:val="99"/>
+    <w:semiHidden/>
+    <w:unhideWhenUsed/>
+    <w:rsid w:val="00951053"/>
+    <w:rPr>
+      <w:b/>
+      <w:bCs/>
+    </w:rPr>
+  </w:style>
+  <w:style w:type="character" w:customStyle="1" w:styleId="CommentSubjectChar">
+    <w:name w:val="Comment Subject Char"/>
+    <w:basedOn w:val="CommentTextChar"/>
+    <w:link w:val="CommentSubject"/>
+    <w:uiPriority w:val="99"/>
+    <w:semiHidden/>
+    <w:rsid w:val="00951053"/>
+    <w:rPr>
+      <w:b/>
+      <w:bCs/>
+      <w:sz w:val="20"/>
+      <w:szCs w:val="20"/>
+    </w:rPr>
+  </w:style>
 </w:styles>
 </file>
 
@@ -3700,4 +4012,16 @@
   </a:objectDefaults>
   <a:extraClrSchemeLst/>
 </a:theme>
+</file>
+
+<file path=customXml/item1.xml><?xml version="1.0" encoding="utf-8"?>
+<b:Sources xmlns:b="http://schemas.openxmlformats.org/officeDocument/2006/bibliography" xmlns="http://schemas.openxmlformats.org/officeDocument/2006/bibliography" SelectedStyle="\APASixthEditionOfficeOnline.xsl" StyleName="APA" Version="6"/>
+</file>
+
+<file path=customXml/itemProps1.xml><?xml version="1.0" encoding="utf-8"?>
+<ds:datastoreItem xmlns:ds="http://schemas.openxmlformats.org/officeDocument/2006/customXml" ds:itemID="{AE7F52E6-C31A-4BCD-8356-8BB54C9DA076}">
+  <ds:schemaRefs>
+    <ds:schemaRef ds:uri="http://schemas.openxmlformats.org/officeDocument/2006/bibliography"/>
+  </ds:schemaRefs>
+</ds:datastoreItem>
 </file>
</xml_diff>